<commit_message>
extend requirement and openapi document
</commit_message>
<xml_diff>
--- a/doc/AccountServiceApi-Requirements.docx
+++ b/doc/AccountServiceApi-Requirements.docx
@@ -39,7 +39,11 @@
       </w:pPr>
       <w:r>
         <w:rPr/>
-        <w:t>0.0.1</w:t>
+        <w:t>0.0.</w:t>
+      </w:r>
+      <w:r>
+        <w:rPr/>
+        <w:t>2</w:t>
       </w:r>
     </w:p>
     <w:p>
@@ -336,32 +340,68 @@
       <w:pPr>
         <w:pStyle w:val="Normal"/>
         <w:numPr>
-          <w:ilvl w:val="1"/>
-          <w:numId w:val="2"/>
-        </w:numPr>
-        <w:bidi w:val="0"/>
-        <w:jc w:val="left"/>
-        <w:rPr/>
-      </w:pPr>
-      <w:r>
-        <w:rPr/>
+          <w:ilvl w:val="0"/>
+          <w:numId w:val="2"/>
+        </w:numPr>
+        <w:bidi w:val="0"/>
+        <w:jc w:val="left"/>
+        <w:rPr>
+          <w:strike/>
+        </w:rPr>
+      </w:pPr>
+      <w:r>
+        <w:rPr>
+          <w:strike/>
+        </w:rPr>
+        <w:t>erstellDatum</w:t>
+      </w:r>
+      <w:r>
+        <w:rPr>
+          <w:strike w:val="false"/>
+          <w:dstrike w:val="false"/>
+        </w:rPr>
+        <w:t xml:space="preserve"> </w:t>
+      </w:r>
+      <w:r>
+        <w:rPr>
+          <w:strike w:val="false"/>
+          <w:dstrike w:val="false"/>
+        </w:rPr>
+        <w:t>(ggf. später, nach weiterer Abstimmung mit dem Fachbereich)</w:t>
+      </w:r>
+    </w:p>
+    <w:p>
+      <w:pPr>
+        <w:pStyle w:val="Normal"/>
+        <w:numPr>
+          <w:ilvl w:val="0"/>
+          <w:numId w:val="2"/>
+        </w:numPr>
+        <w:bidi w:val="0"/>
+        <w:jc w:val="left"/>
+        <w:rPr>
+          <w:strike/>
+        </w:rPr>
+      </w:pPr>
+      <w:r>
+        <w:rPr>
+          <w:strike/>
+        </w:rPr>
         <w:t>letzteAktualisierung</w:t>
       </w:r>
-    </w:p>
-    <w:p>
-      <w:pPr>
-        <w:pStyle w:val="Normal"/>
-        <w:numPr>
-          <w:ilvl w:val="1"/>
-          <w:numId w:val="2"/>
-        </w:numPr>
-        <w:bidi w:val="0"/>
-        <w:jc w:val="left"/>
-        <w:rPr/>
-      </w:pPr>
-      <w:r>
-        <w:rPr/>
-        <w:t>erstellDatum</w:t>
+      <w:r>
+        <w:rPr>
+          <w:strike w:val="false"/>
+          <w:dstrike w:val="false"/>
+        </w:rPr>
+        <w:t xml:space="preserve"> </w:t>
+      </w:r>
+      <w:r>
+        <w:rPr>
+          <w:strike w:val="false"/>
+          <w:dstrike w:val="false"/>
+        </w:rPr>
+        <w:t>(ggf. später, nach weiterer Abstimmung mit dem Fachbereich)</w:t>
       </w:r>
     </w:p>
     <w:p>
@@ -393,53 +433,109 @@
     </w:p>
     <w:p>
       <w:pPr>
-        <w:pStyle w:val="Normal"/>
-        <w:bidi w:val="0"/>
-        <w:jc w:val="left"/>
-        <w:rPr/>
-      </w:pPr>
-      <w:r>
-        <w:rPr/>
-        <w:t>oder</w:t>
-      </w:r>
-    </w:p>
-    <w:p>
-      <w:pPr>
-        <w:pStyle w:val="Normal"/>
-        <w:bidi w:val="0"/>
-        <w:jc w:val="left"/>
-        <w:rPr/>
-      </w:pPr>
-      <w:r>
-        <w:rPr/>
-        <w:t>Bezahlinformation (Kreditkarte | PayPal)</w:t>
-      </w:r>
-    </w:p>
-    <w:p>
-      <w:pPr>
-        <w:pStyle w:val="Normal"/>
-        <w:bidi w:val="0"/>
-        <w:jc w:val="left"/>
-        <w:rPr/>
-      </w:pPr>
-      <w:r>
-        <w:rPr/>
-        <w:tab/>
-        <w:t>→ wie sehen die Felder aus?</w:t>
-      </w:r>
-    </w:p>
-    <w:p>
-      <w:pPr>
-        <w:pStyle w:val="Normal"/>
-        <w:bidi w:val="0"/>
-        <w:jc w:val="left"/>
-        <w:rPr/>
-      </w:pPr>
-      <w:r>
-        <w:rPr/>
-        <w:tab/>
-        <w:tab/>
-        <w:t>z. B. Ablaufdatum, Sicherheitsinformationen, verschlüsselt?, Zugriffsbeschränkung</w:t>
+        <w:pStyle w:val="TextBody"/>
+        <w:numPr>
+          <w:ilvl w:val="0"/>
+          <w:numId w:val="3"/>
+        </w:numPr>
+        <w:bidi w:val="0"/>
+        <w:jc w:val="left"/>
+        <w:rPr/>
+      </w:pPr>
+      <w:r>
+        <w:rPr/>
+        <w:t>CreditCard</w:t>
+      </w:r>
+    </w:p>
+    <w:p>
+      <w:pPr>
+        <w:pStyle w:val="TextBody"/>
+        <w:numPr>
+          <w:ilvl w:val="1"/>
+          <w:numId w:val="3"/>
+        </w:numPr>
+        <w:bidi w:val="0"/>
+        <w:jc w:val="left"/>
+        <w:rPr/>
+      </w:pPr>
+      <w:r>
+        <w:rPr/>
+        <w:t>cardnumber (string) minimal 8 maximal 20 zeichen</w:t>
+      </w:r>
+    </w:p>
+    <w:p>
+      <w:pPr>
+        <w:pStyle w:val="TextBody"/>
+        <w:numPr>
+          <w:ilvl w:val="1"/>
+          <w:numId w:val="3"/>
+        </w:numPr>
+        <w:bidi w:val="0"/>
+        <w:jc w:val="left"/>
+        <w:rPr/>
+      </w:pPr>
+      <w:r>
+        <w:rPr/>
+        <w:t>validity (string)</w:t>
+      </w:r>
+    </w:p>
+    <w:p>
+      <w:pPr>
+        <w:pStyle w:val="TextBody"/>
+        <w:numPr>
+          <w:ilvl w:val="1"/>
+          <w:numId w:val="3"/>
+        </w:numPr>
+        <w:bidi w:val="0"/>
+        <w:jc w:val="left"/>
+        <w:rPr/>
+      </w:pPr>
+      <w:r>
+        <w:rPr/>
+        <w:t>cvv (string) minimum 3 maximal 3</w:t>
+      </w:r>
+    </w:p>
+    <w:p>
+      <w:pPr>
+        <w:pStyle w:val="TextBody"/>
+        <w:numPr>
+          <w:ilvl w:val="0"/>
+          <w:numId w:val="3"/>
+        </w:numPr>
+        <w:bidi w:val="0"/>
+        <w:jc w:val="left"/>
+        <w:rPr/>
+      </w:pPr>
+      <w:r>
+        <w:rPr/>
+        <w:t>PayPal</w:t>
+      </w:r>
+    </w:p>
+    <w:p>
+      <w:pPr>
+        <w:pStyle w:val="TextBody"/>
+        <w:numPr>
+          <w:ilvl w:val="1"/>
+          <w:numId w:val="3"/>
+        </w:numPr>
+        <w:bidi w:val="0"/>
+        <w:jc w:val="left"/>
+        <w:rPr/>
+      </w:pPr>
+      <w:r>
+        <w:rPr/>
+        <w:t>email (string)</w:t>
+      </w:r>
+    </w:p>
+    <w:p>
+      <w:pPr>
+        <w:pStyle w:val="Normal"/>
+        <w:bidi w:val="0"/>
+        <w:jc w:val="left"/>
+        <w:rPr/>
+      </w:pPr>
+      <w:r>
+        <w:rPr/>
       </w:r>
     </w:p>
     <w:sectPr>
@@ -725,6 +821,143 @@
   <w:abstractNum w:abstractNumId="3">
     <w:lvl w:ilvl="0">
       <w:start w:val="1"/>
+      <w:numFmt w:val="bullet"/>
+      <w:lvlText w:val=""/>
+      <w:lvlJc w:val="left"/>
+      <w:pPr>
+        <w:tabs>
+          <w:tab w:val="num" w:pos="720"/>
+        </w:tabs>
+        <w:ind w:left="720" w:hanging="360"/>
+      </w:pPr>
+      <w:rPr>
+        <w:rFonts w:ascii="Symbol" w:hAnsi="Symbol" w:cs="Symbol" w:hint="default"/>
+      </w:rPr>
+    </w:lvl>
+    <w:lvl w:ilvl="1">
+      <w:start w:val="1"/>
+      <w:numFmt w:val="bullet"/>
+      <w:lvlText w:val="◦"/>
+      <w:lvlJc w:val="left"/>
+      <w:pPr>
+        <w:tabs>
+          <w:tab w:val="num" w:pos="1080"/>
+        </w:tabs>
+        <w:ind w:left="1080" w:hanging="360"/>
+      </w:pPr>
+      <w:rPr>
+        <w:rFonts w:ascii="OpenSymbol" w:hAnsi="OpenSymbol" w:cs="OpenSymbol" w:hint="default"/>
+      </w:rPr>
+    </w:lvl>
+    <w:lvl w:ilvl="2">
+      <w:start w:val="1"/>
+      <w:numFmt w:val="bullet"/>
+      <w:lvlText w:val="▪"/>
+      <w:lvlJc w:val="left"/>
+      <w:pPr>
+        <w:tabs>
+          <w:tab w:val="num" w:pos="1440"/>
+        </w:tabs>
+        <w:ind w:left="1440" w:hanging="360"/>
+      </w:pPr>
+      <w:rPr>
+        <w:rFonts w:ascii="OpenSymbol" w:hAnsi="OpenSymbol" w:cs="OpenSymbol" w:hint="default"/>
+      </w:rPr>
+    </w:lvl>
+    <w:lvl w:ilvl="3">
+      <w:start w:val="1"/>
+      <w:numFmt w:val="bullet"/>
+      <w:lvlText w:val=""/>
+      <w:lvlJc w:val="left"/>
+      <w:pPr>
+        <w:tabs>
+          <w:tab w:val="num" w:pos="1800"/>
+        </w:tabs>
+        <w:ind w:left="1800" w:hanging="360"/>
+      </w:pPr>
+      <w:rPr>
+        <w:rFonts w:ascii="Symbol" w:hAnsi="Symbol" w:cs="Symbol" w:hint="default"/>
+      </w:rPr>
+    </w:lvl>
+    <w:lvl w:ilvl="4">
+      <w:start w:val="1"/>
+      <w:numFmt w:val="bullet"/>
+      <w:lvlText w:val="◦"/>
+      <w:lvlJc w:val="left"/>
+      <w:pPr>
+        <w:tabs>
+          <w:tab w:val="num" w:pos="2160"/>
+        </w:tabs>
+        <w:ind w:left="2160" w:hanging="360"/>
+      </w:pPr>
+      <w:rPr>
+        <w:rFonts w:ascii="OpenSymbol" w:hAnsi="OpenSymbol" w:cs="OpenSymbol" w:hint="default"/>
+      </w:rPr>
+    </w:lvl>
+    <w:lvl w:ilvl="5">
+      <w:start w:val="1"/>
+      <w:numFmt w:val="bullet"/>
+      <w:lvlText w:val="▪"/>
+      <w:lvlJc w:val="left"/>
+      <w:pPr>
+        <w:tabs>
+          <w:tab w:val="num" w:pos="2520"/>
+        </w:tabs>
+        <w:ind w:left="2520" w:hanging="360"/>
+      </w:pPr>
+      <w:rPr>
+        <w:rFonts w:ascii="OpenSymbol" w:hAnsi="OpenSymbol" w:cs="OpenSymbol" w:hint="default"/>
+      </w:rPr>
+    </w:lvl>
+    <w:lvl w:ilvl="6">
+      <w:start w:val="1"/>
+      <w:numFmt w:val="bullet"/>
+      <w:lvlText w:val=""/>
+      <w:lvlJc w:val="left"/>
+      <w:pPr>
+        <w:tabs>
+          <w:tab w:val="num" w:pos="2880"/>
+        </w:tabs>
+        <w:ind w:left="2880" w:hanging="360"/>
+      </w:pPr>
+      <w:rPr>
+        <w:rFonts w:ascii="Symbol" w:hAnsi="Symbol" w:cs="Symbol" w:hint="default"/>
+      </w:rPr>
+    </w:lvl>
+    <w:lvl w:ilvl="7">
+      <w:start w:val="1"/>
+      <w:numFmt w:val="bullet"/>
+      <w:lvlText w:val="◦"/>
+      <w:lvlJc w:val="left"/>
+      <w:pPr>
+        <w:tabs>
+          <w:tab w:val="num" w:pos="3240"/>
+        </w:tabs>
+        <w:ind w:left="3240" w:hanging="360"/>
+      </w:pPr>
+      <w:rPr>
+        <w:rFonts w:ascii="OpenSymbol" w:hAnsi="OpenSymbol" w:cs="OpenSymbol" w:hint="default"/>
+      </w:rPr>
+    </w:lvl>
+    <w:lvl w:ilvl="8">
+      <w:start w:val="1"/>
+      <w:numFmt w:val="bullet"/>
+      <w:lvlText w:val="▪"/>
+      <w:lvlJc w:val="left"/>
+      <w:pPr>
+        <w:tabs>
+          <w:tab w:val="num" w:pos="3600"/>
+        </w:tabs>
+        <w:ind w:left="3600" w:hanging="360"/>
+      </w:pPr>
+      <w:rPr>
+        <w:rFonts w:ascii="OpenSymbol" w:hAnsi="OpenSymbol" w:cs="OpenSymbol" w:hint="default"/>
+      </w:rPr>
+    </w:lvl>
+  </w:abstractNum>
+  <w:abstractNum w:abstractNumId="4">
+    <w:lvl w:ilvl="0">
+      <w:start w:val="1"/>
       <w:numFmt w:val="none"/>
       <w:suff w:val="nothing"/>
       <w:lvlText w:val=""/>
@@ -849,6 +1082,9 @@
   </w:num>
   <w:num w:numId="3">
     <w:abstractNumId w:val="3"/>
+  </w:num>
+  <w:num w:numId="4">
+    <w:abstractNumId w:val="4"/>
   </w:num>
 </w:numbering>
 </file>

</xml_diff>